<commit_message>
actualización bitacora, se distorciona la barra de formulas se agregaran todos los botones para posteriormente proceder con la verificación
</commit_message>
<xml_diff>
--- a/Bitacora/5.6 Bitácora de desarrollo.docx
+++ b/Bitacora/5.6 Bitácora de desarrollo.docx
@@ -1652,6 +1652,88 @@
           <w:rFonts w:ascii="Times New Roman" w:hAnsi="Times New Roman" w:cs="Times New Roman"/>
         </w:rPr>
         <w:t>Se debe mejorar la visualización de usuario al tener la barra de formulas no con mucho ancho y el botón guardar sin un tipo de borde para separar.</w:t>
+      </w:r>
+    </w:p>
+    <w:p>
+      <w:pPr>
+        <w:rPr>
+          <w:rFonts w:ascii="Times New Roman" w:hAnsi="Times New Roman" w:cs="Times New Roman"/>
+        </w:rPr>
+      </w:pPr>
+    </w:p>
+    <w:p>
+      <w:pPr>
+        <w:rPr>
+          <w:rFonts w:ascii="Times New Roman" w:hAnsi="Times New Roman" w:cs="Times New Roman"/>
+        </w:rPr>
+      </w:pPr>
+      <w:r>
+        <w:rPr>
+          <w:rFonts w:ascii="Times New Roman" w:hAnsi="Times New Roman" w:cs="Times New Roman"/>
+        </w:rPr>
+        <w:lastRenderedPageBreak/>
+        <w:drawing>
+          <wp:anchor distT="0" distB="0" distL="114300" distR="114300" simplePos="0" relativeHeight="251665408" behindDoc="0" locked="0" layoutInCell="1" allowOverlap="1" wp14:anchorId="20EB8E61" wp14:editId="7B57BE46">
+            <wp:simplePos x="0" y="0"/>
+            <wp:positionH relativeFrom="column">
+              <wp:posOffset>1905</wp:posOffset>
+            </wp:positionH>
+            <wp:positionV relativeFrom="paragraph">
+              <wp:posOffset>0</wp:posOffset>
+            </wp:positionV>
+            <wp:extent cx="5612130" cy="1071880"/>
+            <wp:effectExtent l="0" t="0" r="7620" b="0"/>
+            <wp:wrapTopAndBottom/>
+            <wp:docPr id="1975186389" name="Imagen 1"/>
+            <wp:cNvGraphicFramePr>
+              <a:graphicFrameLocks xmlns:a="http://schemas.openxmlformats.org/drawingml/2006/main" noChangeAspect="1"/>
+            </wp:cNvGraphicFramePr>
+            <a:graphic xmlns:a="http://schemas.openxmlformats.org/drawingml/2006/main">
+              <a:graphicData uri="http://schemas.openxmlformats.org/drawingml/2006/picture">
+                <pic:pic xmlns:pic="http://schemas.openxmlformats.org/drawingml/2006/picture">
+                  <pic:nvPicPr>
+                    <pic:cNvPr id="1975186389" name=""/>
+                    <pic:cNvPicPr/>
+                  </pic:nvPicPr>
+                  <pic:blipFill>
+                    <a:blip r:embed="rId20">
+                      <a:extLst>
+                        <a:ext uri="{28A0092B-C50C-407E-A947-70E740481C1C}">
+                          <a14:useLocalDpi xmlns:a14="http://schemas.microsoft.com/office/drawing/2010/main" val="0"/>
+                        </a:ext>
+                      </a:extLst>
+                    </a:blip>
+                    <a:stretch>
+                      <a:fillRect/>
+                    </a:stretch>
+                  </pic:blipFill>
+                  <pic:spPr>
+                    <a:xfrm>
+                      <a:off x="0" y="0"/>
+                      <a:ext cx="5612130" cy="1071880"/>
+                    </a:xfrm>
+                    <a:prstGeom prst="rect">
+                      <a:avLst/>
+                    </a:prstGeom>
+                  </pic:spPr>
+                </pic:pic>
+              </a:graphicData>
+            </a:graphic>
+          </wp:anchor>
+        </w:drawing>
+      </w:r>
+    </w:p>
+    <w:p>
+      <w:pPr>
+        <w:rPr>
+          <w:rFonts w:ascii="Times New Roman" w:hAnsi="Times New Roman" w:cs="Times New Roman"/>
+        </w:rPr>
+      </w:pPr>
+      <w:r>
+        <w:rPr>
+          <w:rFonts w:ascii="Times New Roman" w:hAnsi="Times New Roman" w:cs="Times New Roman"/>
+        </w:rPr>
+        <w:t>Se mejora la visualización del botón Guardar, pero se afecta la barra de formulas.</w:t>
       </w:r>
     </w:p>
     <w:p>

</xml_diff>

<commit_message>
se modifica estilos css para evitar que la información se sobreponga en encabezado fijo
</commit_message>
<xml_diff>
--- a/Bitacora/5.6 Bitácora de desarrollo.docx
+++ b/Bitacora/5.6 Bitácora de desarrollo.docx
@@ -1730,7 +1730,19 @@
         <w:rPr>
           <w:rFonts w:ascii="Times New Roman" w:hAnsi="Times New Roman" w:cs="Times New Roman"/>
         </w:rPr>
-        <w:t>Se detecta la necesitad de integrar un botón Limpiar, para tener una mejor experiencia de usuario.</w:t>
+        <w:t xml:space="preserve">Se detecta la </w:t>
+      </w:r>
+      <w:r>
+        <w:rPr>
+          <w:rFonts w:ascii="Times New Roman" w:hAnsi="Times New Roman" w:cs="Times New Roman"/>
+        </w:rPr>
+        <w:t>necesidad</w:t>
+      </w:r>
+      <w:r>
+        <w:rPr>
+          <w:rFonts w:ascii="Times New Roman" w:hAnsi="Times New Roman" w:cs="Times New Roman"/>
+        </w:rPr>
+        <w:t xml:space="preserve"> de integrar un botón Limpiar, para tener una mejor experiencia de usuario.</w:t>
       </w:r>
     </w:p>
     <w:p>
@@ -1868,6 +1880,375 @@
           <w:rFonts w:ascii="Times New Roman" w:hAnsi="Times New Roman" w:cs="Times New Roman"/>
         </w:rPr>
         <w:t>información, los tres botones ya son funcionales</w:t>
+      </w:r>
+      <w:r>
+        <w:rPr>
+          <w:rFonts w:ascii="Times New Roman" w:hAnsi="Times New Roman" w:cs="Times New Roman"/>
+          <w:u w:val="single"/>
+        </w:rPr>
+        <w:t>.</w:t>
+      </w:r>
+    </w:p>
+    <w:p>
+      <w:pPr>
+        <w:ind w:left="708" w:hanging="708"/>
+        <w:rPr>
+          <w:rFonts w:ascii="Times New Roman" w:hAnsi="Times New Roman" w:cs="Times New Roman"/>
+          <w:u w:val="single"/>
+        </w:rPr>
+      </w:pPr>
+    </w:p>
+    <w:p>
+      <w:pPr>
+        <w:ind w:left="708" w:hanging="708"/>
+        <w:rPr>
+          <w:rFonts w:ascii="Times New Roman" w:hAnsi="Times New Roman" w:cs="Times New Roman"/>
+        </w:rPr>
+      </w:pPr>
+      <w:r>
+        <w:rPr>
+          <w:rFonts w:ascii="Times New Roman" w:hAnsi="Times New Roman" w:cs="Times New Roman"/>
+          <w:noProof/>
+        </w:rPr>
+        <w:lastRenderedPageBreak/>
+        <w:drawing>
+          <wp:anchor distT="0" distB="0" distL="114300" distR="114300" simplePos="0" relativeHeight="251671552" behindDoc="0" locked="0" layoutInCell="1" allowOverlap="1" wp14:anchorId="3CF631BB" wp14:editId="24274865">
+            <wp:simplePos x="0" y="0"/>
+            <wp:positionH relativeFrom="margin">
+              <wp:align>left</wp:align>
+            </wp:positionH>
+            <wp:positionV relativeFrom="paragraph">
+              <wp:posOffset>5309922</wp:posOffset>
+            </wp:positionV>
+            <wp:extent cx="5950067" cy="421065"/>
+            <wp:effectExtent l="0" t="0" r="0" b="0"/>
+            <wp:wrapTopAndBottom/>
+            <wp:docPr id="1106224727" name="Imagen 1"/>
+            <wp:cNvGraphicFramePr>
+              <a:graphicFrameLocks xmlns:a="http://schemas.openxmlformats.org/drawingml/2006/main" noChangeAspect="1"/>
+            </wp:cNvGraphicFramePr>
+            <a:graphic xmlns:a="http://schemas.openxmlformats.org/drawingml/2006/main">
+              <a:graphicData uri="http://schemas.openxmlformats.org/drawingml/2006/picture">
+                <pic:pic xmlns:pic="http://schemas.openxmlformats.org/drawingml/2006/picture">
+                  <pic:nvPicPr>
+                    <pic:cNvPr id="0" name="Picture 2"/>
+                    <pic:cNvPicPr>
+                      <a:picLocks noChangeAspect="1" noChangeArrowheads="1"/>
+                    </pic:cNvPicPr>
+                  </pic:nvPicPr>
+                  <pic:blipFill>
+                    <a:blip r:embed="rId24">
+                      <a:extLst>
+                        <a:ext uri="{28A0092B-C50C-407E-A947-70E740481C1C}">
+                          <a14:useLocalDpi xmlns:a14="http://schemas.microsoft.com/office/drawing/2010/main" val="0"/>
+                        </a:ext>
+                      </a:extLst>
+                    </a:blip>
+                    <a:srcRect/>
+                    <a:stretch>
+                      <a:fillRect/>
+                    </a:stretch>
+                  </pic:blipFill>
+                  <pic:spPr bwMode="auto">
+                    <a:xfrm>
+                      <a:off x="0" y="0"/>
+                      <a:ext cx="5950067" cy="421065"/>
+                    </a:xfrm>
+                    <a:prstGeom prst="rect">
+                      <a:avLst/>
+                    </a:prstGeom>
+                    <a:noFill/>
+                  </pic:spPr>
+                </pic:pic>
+              </a:graphicData>
+            </a:graphic>
+            <wp14:sizeRelH relativeFrom="margin">
+              <wp14:pctWidth>0</wp14:pctWidth>
+            </wp14:sizeRelH>
+            <wp14:sizeRelV relativeFrom="margin">
+              <wp14:pctHeight>0</wp14:pctHeight>
+            </wp14:sizeRelV>
+          </wp:anchor>
+        </w:drawing>
+      </w:r>
+      <w:r>
+        <w:rPr>
+          <w:rFonts w:ascii="Times New Roman" w:hAnsi="Times New Roman" w:cs="Times New Roman"/>
+        </w:rPr>
+        <w:drawing>
+          <wp:anchor distT="0" distB="0" distL="114300" distR="114300" simplePos="0" relativeHeight="251669504" behindDoc="0" locked="0" layoutInCell="1" allowOverlap="1" wp14:anchorId="59763CF8" wp14:editId="6205889E">
+            <wp:simplePos x="0" y="0"/>
+            <wp:positionH relativeFrom="column">
+              <wp:posOffset>2216</wp:posOffset>
+            </wp:positionH>
+            <wp:positionV relativeFrom="paragraph">
+              <wp:posOffset>389</wp:posOffset>
+            </wp:positionV>
+            <wp:extent cx="4788146" cy="3168813"/>
+            <wp:effectExtent l="0" t="0" r="0" b="0"/>
+            <wp:wrapTopAndBottom/>
+            <wp:docPr id="383110656" name="Imagen 1"/>
+            <wp:cNvGraphicFramePr>
+              <a:graphicFrameLocks xmlns:a="http://schemas.openxmlformats.org/drawingml/2006/main" noChangeAspect="1"/>
+            </wp:cNvGraphicFramePr>
+            <a:graphic xmlns:a="http://schemas.openxmlformats.org/drawingml/2006/main">
+              <a:graphicData uri="http://schemas.openxmlformats.org/drawingml/2006/picture">
+                <pic:pic xmlns:pic="http://schemas.openxmlformats.org/drawingml/2006/picture">
+                  <pic:nvPicPr>
+                    <pic:cNvPr id="383110656" name=""/>
+                    <pic:cNvPicPr/>
+                  </pic:nvPicPr>
+                  <pic:blipFill>
+                    <a:blip r:embed="rId25">
+                      <a:extLst>
+                        <a:ext uri="{28A0092B-C50C-407E-A947-70E740481C1C}">
+                          <a14:useLocalDpi xmlns:a14="http://schemas.microsoft.com/office/drawing/2010/main" val="0"/>
+                        </a:ext>
+                      </a:extLst>
+                    </a:blip>
+                    <a:stretch>
+                      <a:fillRect/>
+                    </a:stretch>
+                  </pic:blipFill>
+                  <pic:spPr>
+                    <a:xfrm>
+                      <a:off x="0" y="0"/>
+                      <a:ext cx="4788146" cy="3168813"/>
+                    </a:xfrm>
+                    <a:prstGeom prst="rect">
+                      <a:avLst/>
+                    </a:prstGeom>
+                  </pic:spPr>
+                </pic:pic>
+              </a:graphicData>
+            </a:graphic>
+          </wp:anchor>
+        </w:drawing>
+      </w:r>
+      <w:r>
+        <w:rPr>
+          <w:rFonts w:ascii="Times New Roman" w:hAnsi="Times New Roman" w:cs="Times New Roman"/>
+        </w:rPr>
+        <w:t>Los cuatro botones son funcionales</w:t>
+      </w:r>
+      <w:r>
+        <w:rPr>
+          <w:rFonts w:ascii="Times New Roman" w:hAnsi="Times New Roman" w:cs="Times New Roman"/>
+        </w:rPr>
+        <w:t>, permite la exportación de nuestros datos.</w:t>
+      </w:r>
+    </w:p>
+    <w:p>
+      <w:pPr>
+        <w:ind w:left="708" w:hanging="708"/>
+        <w:rPr>
+          <w:rFonts w:ascii="Times New Roman" w:hAnsi="Times New Roman" w:cs="Times New Roman"/>
+        </w:rPr>
+      </w:pPr>
+      <w:r>
+        <w:rPr>
+          <w:rFonts w:ascii="Times New Roman" w:hAnsi="Times New Roman" w:cs="Times New Roman"/>
+        </w:rPr>
+        <w:drawing>
+          <wp:anchor distT="0" distB="0" distL="114300" distR="114300" simplePos="0" relativeHeight="251672576" behindDoc="0" locked="0" layoutInCell="1" allowOverlap="1" wp14:anchorId="55E4E8B2" wp14:editId="1BD2EEFD">
+            <wp:simplePos x="0" y="0"/>
+            <wp:positionH relativeFrom="margin">
+              <wp:align>left</wp:align>
+            </wp:positionH>
+            <wp:positionV relativeFrom="paragraph">
+              <wp:posOffset>2558596</wp:posOffset>
+            </wp:positionV>
+            <wp:extent cx="2425700" cy="1212850"/>
+            <wp:effectExtent l="0" t="0" r="0" b="6350"/>
+            <wp:wrapTopAndBottom/>
+            <wp:docPr id="1716582720" name="Imagen 1"/>
+            <wp:cNvGraphicFramePr>
+              <a:graphicFrameLocks xmlns:a="http://schemas.openxmlformats.org/drawingml/2006/main" noChangeAspect="1"/>
+            </wp:cNvGraphicFramePr>
+            <a:graphic xmlns:a="http://schemas.openxmlformats.org/drawingml/2006/main">
+              <a:graphicData uri="http://schemas.openxmlformats.org/drawingml/2006/picture">
+                <pic:pic xmlns:pic="http://schemas.openxmlformats.org/drawingml/2006/picture">
+                  <pic:nvPicPr>
+                    <pic:cNvPr id="1716582720" name=""/>
+                    <pic:cNvPicPr/>
+                  </pic:nvPicPr>
+                  <pic:blipFill>
+                    <a:blip r:embed="rId26" cstate="print">
+                      <a:extLst>
+                        <a:ext uri="{28A0092B-C50C-407E-A947-70E740481C1C}">
+                          <a14:useLocalDpi xmlns:a14="http://schemas.microsoft.com/office/drawing/2010/main" val="0"/>
+                        </a:ext>
+                      </a:extLst>
+                    </a:blip>
+                    <a:stretch>
+                      <a:fillRect/>
+                    </a:stretch>
+                  </pic:blipFill>
+                  <pic:spPr>
+                    <a:xfrm>
+                      <a:off x="0" y="0"/>
+                      <a:ext cx="2425700" cy="1212850"/>
+                    </a:xfrm>
+                    <a:prstGeom prst="rect">
+                      <a:avLst/>
+                    </a:prstGeom>
+                  </pic:spPr>
+                </pic:pic>
+              </a:graphicData>
+            </a:graphic>
+            <wp14:sizeRelH relativeFrom="margin">
+              <wp14:pctWidth>0</wp14:pctWidth>
+            </wp14:sizeRelH>
+            <wp14:sizeRelV relativeFrom="margin">
+              <wp14:pctHeight>0</wp14:pctHeight>
+            </wp14:sizeRelV>
+          </wp:anchor>
+        </w:drawing>
+      </w:r>
+      <w:r>
+        <w:rPr>
+          <w:rFonts w:ascii="Times New Roman" w:hAnsi="Times New Roman" w:cs="Times New Roman"/>
+        </w:rPr>
+        <w:drawing>
+          <wp:anchor distT="0" distB="0" distL="114300" distR="114300" simplePos="0" relativeHeight="251670528" behindDoc="0" locked="0" layoutInCell="1" allowOverlap="1" wp14:anchorId="3BECA6C0" wp14:editId="43E0A2D0">
+            <wp:simplePos x="0" y="0"/>
+            <wp:positionH relativeFrom="column">
+              <wp:posOffset>2216</wp:posOffset>
+            </wp:positionH>
+            <wp:positionV relativeFrom="paragraph">
+              <wp:posOffset>2812</wp:posOffset>
+            </wp:positionV>
+            <wp:extent cx="5612130" cy="1781810"/>
+            <wp:effectExtent l="0" t="0" r="7620" b="8890"/>
+            <wp:wrapTopAndBottom/>
+            <wp:docPr id="835848217" name="Imagen 1"/>
+            <wp:cNvGraphicFramePr>
+              <a:graphicFrameLocks xmlns:a="http://schemas.openxmlformats.org/drawingml/2006/main" noChangeAspect="1"/>
+            </wp:cNvGraphicFramePr>
+            <a:graphic xmlns:a="http://schemas.openxmlformats.org/drawingml/2006/main">
+              <a:graphicData uri="http://schemas.openxmlformats.org/drawingml/2006/picture">
+                <pic:pic xmlns:pic="http://schemas.openxmlformats.org/drawingml/2006/picture">
+                  <pic:nvPicPr>
+                    <pic:cNvPr id="835848217" name=""/>
+                    <pic:cNvPicPr/>
+                  </pic:nvPicPr>
+                  <pic:blipFill>
+                    <a:blip r:embed="rId27" cstate="print">
+                      <a:extLst>
+                        <a:ext uri="{28A0092B-C50C-407E-A947-70E740481C1C}">
+                          <a14:useLocalDpi xmlns:a14="http://schemas.microsoft.com/office/drawing/2010/main" val="0"/>
+                        </a:ext>
+                      </a:extLst>
+                    </a:blip>
+                    <a:stretch>
+                      <a:fillRect/>
+                    </a:stretch>
+                  </pic:blipFill>
+                  <pic:spPr>
+                    <a:xfrm>
+                      <a:off x="0" y="0"/>
+                      <a:ext cx="5612130" cy="1781810"/>
+                    </a:xfrm>
+                    <a:prstGeom prst="rect">
+                      <a:avLst/>
+                    </a:prstGeom>
+                  </pic:spPr>
+                </pic:pic>
+              </a:graphicData>
+            </a:graphic>
+          </wp:anchor>
+        </w:drawing>
+      </w:r>
+      <w:r>
+        <w:rPr>
+          <w:rFonts w:ascii="Times New Roman" w:hAnsi="Times New Roman" w:cs="Times New Roman"/>
+        </w:rPr>
+        <w:t>vista desde Excel original.</w:t>
+      </w:r>
+    </w:p>
+    <w:p>
+      <w:pPr>
+        <w:ind w:left="708" w:hanging="708"/>
+        <w:rPr>
+          <w:rFonts w:ascii="Times New Roman" w:hAnsi="Times New Roman" w:cs="Times New Roman"/>
+        </w:rPr>
+      </w:pPr>
+    </w:p>
+    <w:p>
+      <w:pPr>
+        <w:ind w:left="708" w:hanging="708"/>
+        <w:rPr>
+          <w:rFonts w:ascii="Times New Roman" w:hAnsi="Times New Roman" w:cs="Times New Roman"/>
+        </w:rPr>
+      </w:pPr>
+      <w:r>
+        <w:rPr>
+          <w:rFonts w:ascii="Times New Roman" w:hAnsi="Times New Roman" w:cs="Times New Roman"/>
+        </w:rPr>
+        <w:t>Con respecto a la barra de formulas presente el problema de no tener un diseño adecuado, también los datos que escribimos en las celdas se sobrescriben en el encabezado de columnas.</w:t>
+      </w:r>
+    </w:p>
+    <w:p>
+      <w:pPr>
+        <w:ind w:left="708" w:hanging="708"/>
+        <w:rPr>
+          <w:rFonts w:ascii="Times New Roman" w:hAnsi="Times New Roman" w:cs="Times New Roman"/>
+        </w:rPr>
+      </w:pPr>
+      <w:r>
+        <w:rPr>
+          <w:rFonts w:ascii="Times New Roman" w:hAnsi="Times New Roman" w:cs="Times New Roman"/>
+        </w:rPr>
+        <w:lastRenderedPageBreak/>
+        <w:drawing>
+          <wp:anchor distT="0" distB="0" distL="114300" distR="114300" simplePos="0" relativeHeight="251673600" behindDoc="0" locked="0" layoutInCell="1" allowOverlap="1" wp14:anchorId="622E9F32" wp14:editId="11645CD7">
+            <wp:simplePos x="0" y="0"/>
+            <wp:positionH relativeFrom="column">
+              <wp:posOffset>-203368</wp:posOffset>
+            </wp:positionH>
+            <wp:positionV relativeFrom="paragraph">
+              <wp:posOffset>223934</wp:posOffset>
+            </wp:positionV>
+            <wp:extent cx="5612130" cy="1595755"/>
+            <wp:effectExtent l="0" t="0" r="7620" b="4445"/>
+            <wp:wrapTopAndBottom/>
+            <wp:docPr id="1016695925" name="Imagen 1"/>
+            <wp:cNvGraphicFramePr>
+              <a:graphicFrameLocks xmlns:a="http://schemas.openxmlformats.org/drawingml/2006/main" noChangeAspect="1"/>
+            </wp:cNvGraphicFramePr>
+            <a:graphic xmlns:a="http://schemas.openxmlformats.org/drawingml/2006/main">
+              <a:graphicData uri="http://schemas.openxmlformats.org/drawingml/2006/picture">
+                <pic:pic xmlns:pic="http://schemas.openxmlformats.org/drawingml/2006/picture">
+                  <pic:nvPicPr>
+                    <pic:cNvPr id="1016695925" name=""/>
+                    <pic:cNvPicPr/>
+                  </pic:nvPicPr>
+                  <pic:blipFill>
+                    <a:blip r:embed="rId28" cstate="print">
+                      <a:extLst>
+                        <a:ext uri="{28A0092B-C50C-407E-A947-70E740481C1C}">
+                          <a14:useLocalDpi xmlns:a14="http://schemas.microsoft.com/office/drawing/2010/main" val="0"/>
+                        </a:ext>
+                      </a:extLst>
+                    </a:blip>
+                    <a:stretch>
+                      <a:fillRect/>
+                    </a:stretch>
+                  </pic:blipFill>
+                  <pic:spPr>
+                    <a:xfrm>
+                      <a:off x="0" y="0"/>
+                      <a:ext cx="5612130" cy="1595755"/>
+                    </a:xfrm>
+                    <a:prstGeom prst="rect">
+                      <a:avLst/>
+                    </a:prstGeom>
+                  </pic:spPr>
+                </pic:pic>
+              </a:graphicData>
+            </a:graphic>
+          </wp:anchor>
+        </w:drawing>
       </w:r>
     </w:p>
     <w:sectPr>

</xml_diff>

<commit_message>
actualización bitacora, al momento de seleccionar celdas las referencias se duplicaban. Ya fue solucionado
</commit_message>
<xml_diff>
--- a/Bitacora/5.6 Bitácora de desarrollo.docx
+++ b/Bitacora/5.6 Bitácora de desarrollo.docx
@@ -204,7 +204,21 @@
         <w:rPr>
           <w:rFonts w:ascii="Times New Roman" w:hAnsi="Times New Roman" w:cs="Times New Roman"/>
         </w:rPr>
-        <w:t>Proceso de análisis y diseño en 5.2 Diagramas de flujo (PSeInt)(inciso 1 y 2)</w:t>
+        <w:t>Proceso de análisis y diseño en 5.2 Diagramas de flujo (PSeInt</w:t>
+      </w:r>
+      <w:proofErr w:type="gramStart"/>
+      <w:r>
+        <w:rPr>
+          <w:rFonts w:ascii="Times New Roman" w:hAnsi="Times New Roman" w:cs="Times New Roman"/>
+        </w:rPr>
+        <w:t>)(</w:t>
+      </w:r>
+      <w:proofErr w:type="gramEnd"/>
+      <w:r>
+        <w:rPr>
+          <w:rFonts w:ascii="Times New Roman" w:hAnsi="Times New Roman" w:cs="Times New Roman"/>
+        </w:rPr>
+        <w:t>inciso 1 y 2)</w:t>
       </w:r>
     </w:p>
     <w:p>
@@ -354,7 +368,21 @@
         <w:rPr>
           <w:rFonts w:ascii="Times New Roman" w:hAnsi="Times New Roman" w:cs="Times New Roman"/>
         </w:rPr>
-        <w:t>Avance: Se trabajó en el punto 3, evaluación de la expresión tokenizada.</w:t>
+        <w:t xml:space="preserve">Avance: Se trabajó en el punto 3, evaluación de la expresión </w:t>
+      </w:r>
+      <w:proofErr w:type="spellStart"/>
+      <w:r>
+        <w:rPr>
+          <w:rFonts w:ascii="Times New Roman" w:hAnsi="Times New Roman" w:cs="Times New Roman"/>
+        </w:rPr>
+        <w:t>tokenizada</w:t>
+      </w:r>
+      <w:proofErr w:type="spellEnd"/>
+      <w:r>
+        <w:rPr>
+          <w:rFonts w:ascii="Times New Roman" w:hAnsi="Times New Roman" w:cs="Times New Roman"/>
+        </w:rPr>
+        <w:t>.</w:t>
       </w:r>
     </w:p>
     <w:p>
@@ -458,7 +486,21 @@
         <w:rPr>
           <w:rFonts w:ascii="Times New Roman" w:hAnsi="Times New Roman" w:cs="Times New Roman"/>
         </w:rPr>
-        <w:t>Decisión y solución: Se implementó PropagarCambios para recorrer las dependencias y recalcular las celdas en el orden correspondiente.</w:t>
+        <w:t xml:space="preserve">Decisión y solución: Se implementó </w:t>
+      </w:r>
+      <w:proofErr w:type="spellStart"/>
+      <w:r>
+        <w:rPr>
+          <w:rFonts w:ascii="Times New Roman" w:hAnsi="Times New Roman" w:cs="Times New Roman"/>
+        </w:rPr>
+        <w:t>PropagarCambios</w:t>
+      </w:r>
+      <w:proofErr w:type="spellEnd"/>
+      <w:r>
+        <w:rPr>
+          <w:rFonts w:ascii="Times New Roman" w:hAnsi="Times New Roman" w:cs="Times New Roman"/>
+        </w:rPr>
+        <w:t xml:space="preserve"> para recorrer las dependencias y recalcular las celdas en el orden correspondiente.</w:t>
       </w:r>
     </w:p>
     <w:p>
@@ -670,7 +712,21 @@
           <w:rFonts w:ascii="Times New Roman" w:hAnsi="Times New Roman" w:cs="Times New Roman"/>
         </w:rPr>
         <w:br/>
-        <w:t xml:space="preserve">Se implementó DetectarReferenciaCircular para recorrer las dependencias y comprobar si </w:t>
+        <w:t xml:space="preserve">Se implementó </w:t>
+      </w:r>
+      <w:proofErr w:type="spellStart"/>
+      <w:r>
+        <w:rPr>
+          <w:rFonts w:ascii="Times New Roman" w:hAnsi="Times New Roman" w:cs="Times New Roman"/>
+        </w:rPr>
+        <w:t>DetectarReferenciaCircular</w:t>
+      </w:r>
+      <w:proofErr w:type="spellEnd"/>
+      <w:r>
+        <w:rPr>
+          <w:rFonts w:ascii="Times New Roman" w:hAnsi="Times New Roman" w:cs="Times New Roman"/>
+        </w:rPr>
+        <w:t xml:space="preserve"> para recorrer las dependencias y comprobar si </w:t>
       </w:r>
       <w:r>
         <w:rPr>
@@ -862,7 +918,21 @@
         <w:rPr>
           <w:rFonts w:ascii="Times New Roman" w:hAnsi="Times New Roman" w:cs="Times New Roman"/>
         </w:rPr>
-        <w:t>Esto ocupaba mucho espacio por lo que se investigo como hacerlo ya que coloque tres títulos.</w:t>
+        <w:t xml:space="preserve">Esto ocupaba mucho espacio por lo que se </w:t>
+      </w:r>
+      <w:proofErr w:type="spellStart"/>
+      <w:r>
+        <w:rPr>
+          <w:rFonts w:ascii="Times New Roman" w:hAnsi="Times New Roman" w:cs="Times New Roman"/>
+        </w:rPr>
+        <w:t>investigo</w:t>
+      </w:r>
+      <w:proofErr w:type="spellEnd"/>
+      <w:r>
+        <w:rPr>
+          <w:rFonts w:ascii="Times New Roman" w:hAnsi="Times New Roman" w:cs="Times New Roman"/>
+        </w:rPr>
+        <w:t xml:space="preserve"> como hacerlo ya que coloque tres títulos.</w:t>
       </w:r>
     </w:p>
     <w:p>
@@ -936,7 +1006,21 @@
         <w:rPr>
           <w:rFonts w:ascii="Times New Roman" w:hAnsi="Times New Roman" w:cs="Times New Roman"/>
         </w:rPr>
-        <w:t>Obteniendo algo más ordenado, pero hasta este punto con referente a la barra de tareas no tenia las medidas exactas para cumplir con una mejor interfaz.</w:t>
+        <w:t xml:space="preserve">Obteniendo algo más ordenado, pero hasta este punto con referente a la barra de tareas no </w:t>
+      </w:r>
+      <w:proofErr w:type="spellStart"/>
+      <w:r>
+        <w:rPr>
+          <w:rFonts w:ascii="Times New Roman" w:hAnsi="Times New Roman" w:cs="Times New Roman"/>
+        </w:rPr>
+        <w:t>tenia</w:t>
+      </w:r>
+      <w:proofErr w:type="spellEnd"/>
+      <w:r>
+        <w:rPr>
+          <w:rFonts w:ascii="Times New Roman" w:hAnsi="Times New Roman" w:cs="Times New Roman"/>
+        </w:rPr>
+        <w:t xml:space="preserve"> las medidas exactas para cumplir con una mejor interfaz.</w:t>
       </w:r>
     </w:p>
     <w:p>
@@ -1344,7 +1428,21 @@
         <w:rPr>
           <w:rFonts w:ascii="Times New Roman" w:hAnsi="Times New Roman" w:cs="Times New Roman"/>
         </w:rPr>
-        <w:t>=SUMA(A1:A2)</w:t>
+        <w:t>=</w:t>
+      </w:r>
+      <w:proofErr w:type="gramStart"/>
+      <w:r>
+        <w:rPr>
+          <w:rFonts w:ascii="Times New Roman" w:hAnsi="Times New Roman" w:cs="Times New Roman"/>
+        </w:rPr>
+        <w:t>SUMA(</w:t>
+      </w:r>
+      <w:proofErr w:type="gramEnd"/>
+      <w:r>
+        <w:rPr>
+          <w:rFonts w:ascii="Times New Roman" w:hAnsi="Times New Roman" w:cs="Times New Roman"/>
+        </w:rPr>
+        <w:t>A1:A2)</w:t>
       </w:r>
       <w:r>
         <w:rPr>
@@ -2266,6 +2364,7 @@
     </w:p>
     <w:p>
       <w:pPr>
+        <w:spacing w:after="0"/>
         <w:ind w:left="708" w:hanging="708"/>
         <w:rPr>
           <w:rFonts w:ascii="Times New Roman" w:hAnsi="Times New Roman" w:cs="Times New Roman"/>
@@ -2276,7 +2375,165 @@
         <w:rPr>
           <w:rFonts w:ascii="Times New Roman" w:hAnsi="Times New Roman" w:cs="Times New Roman"/>
         </w:rPr>
-        <w:t>Se agrega la función de ctrl+z para deshacer, pero ocurre el problema que elimina todos los datos si no hemos dado guardar, el objetivo es deshacer celda por celda.</w:t>
+        <w:t xml:space="preserve">Se agrega la función de </w:t>
+      </w:r>
+      <w:proofErr w:type="spellStart"/>
+      <w:r>
+        <w:rPr>
+          <w:rFonts w:ascii="Times New Roman" w:hAnsi="Times New Roman" w:cs="Times New Roman"/>
+        </w:rPr>
+        <w:t>ctrl+z</w:t>
+      </w:r>
+      <w:proofErr w:type="spellEnd"/>
+      <w:r>
+        <w:rPr>
+          <w:rFonts w:ascii="Times New Roman" w:hAnsi="Times New Roman" w:cs="Times New Roman"/>
+        </w:rPr>
+        <w:t xml:space="preserve"> para deshacer, pero ocurre el problema que elimina todos los datos si no hemos dado guardar, el objetivo es deshacer celda por celda.</w:t>
+      </w:r>
+    </w:p>
+    <w:p>
+      <w:pPr>
+        <w:ind w:left="708" w:hanging="708"/>
+        <w:rPr>
+          <w:rFonts w:ascii="Times New Roman" w:hAnsi="Times New Roman" w:cs="Times New Roman"/>
+          <w:u w:val="single"/>
+        </w:rPr>
+      </w:pPr>
+      <w:r>
+        <w:rPr>
+          <w:rFonts w:ascii="Times New Roman" w:hAnsi="Times New Roman" w:cs="Times New Roman"/>
+          <w:u w:val="single"/>
+        </w:rPr>
+        <w:drawing>
+          <wp:inline distT="0" distB="0" distL="0" distR="0" wp14:anchorId="15ADA9B2" wp14:editId="4253D387">
+            <wp:extent cx="3245017" cy="2095608"/>
+            <wp:effectExtent l="0" t="0" r="0" b="0"/>
+            <wp:docPr id="507249452" name="Imagen 1"/>
+            <wp:cNvGraphicFramePr>
+              <a:graphicFrameLocks xmlns:a="http://schemas.openxmlformats.org/drawingml/2006/main" noChangeAspect="1"/>
+            </wp:cNvGraphicFramePr>
+            <a:graphic xmlns:a="http://schemas.openxmlformats.org/drawingml/2006/main">
+              <a:graphicData uri="http://schemas.openxmlformats.org/drawingml/2006/picture">
+                <pic:pic xmlns:pic="http://schemas.openxmlformats.org/drawingml/2006/picture">
+                  <pic:nvPicPr>
+                    <pic:cNvPr id="507249452" name=""/>
+                    <pic:cNvPicPr/>
+                  </pic:nvPicPr>
+                  <pic:blipFill>
+                    <a:blip r:embed="rId29"/>
+                    <a:stretch>
+                      <a:fillRect/>
+                    </a:stretch>
+                  </pic:blipFill>
+                  <pic:spPr>
+                    <a:xfrm>
+                      <a:off x="0" y="0"/>
+                      <a:ext cx="3245017" cy="2095608"/>
+                    </a:xfrm>
+                    <a:prstGeom prst="rect">
+                      <a:avLst/>
+                    </a:prstGeom>
+                  </pic:spPr>
+                </pic:pic>
+              </a:graphicData>
+            </a:graphic>
+          </wp:inline>
+        </w:drawing>
+      </w:r>
+    </w:p>
+    <w:p>
+      <w:pPr>
+        <w:ind w:left="708" w:hanging="708"/>
+        <w:rPr>
+          <w:rFonts w:ascii="Times New Roman" w:hAnsi="Times New Roman" w:cs="Times New Roman"/>
+        </w:rPr>
+      </w:pPr>
+      <w:r>
+        <w:rPr>
+          <w:rFonts w:ascii="Times New Roman" w:hAnsi="Times New Roman" w:cs="Times New Roman"/>
+        </w:rPr>
+        <w:t>Al momento de realizar este tipo de operación, agrega la referencia de celdas duplicadas.</w:t>
+      </w:r>
+    </w:p>
+    <w:p>
+      <w:pPr>
+        <w:ind w:left="708" w:hanging="708"/>
+        <w:rPr>
+          <w:rFonts w:ascii="Times New Roman" w:hAnsi="Times New Roman" w:cs="Times New Roman"/>
+        </w:rPr>
+      </w:pPr>
+      <w:r>
+        <w:rPr>
+          <w:rFonts w:ascii="Times New Roman" w:hAnsi="Times New Roman" w:cs="Times New Roman"/>
+        </w:rPr>
+        <w:drawing>
+          <wp:inline distT="0" distB="0" distL="0" distR="0" wp14:anchorId="5F6808B2" wp14:editId="352283B5">
+            <wp:extent cx="3302170" cy="1511378"/>
+            <wp:effectExtent l="0" t="0" r="0" b="0"/>
+            <wp:docPr id="165680092" name="Imagen 1"/>
+            <wp:cNvGraphicFramePr>
+              <a:graphicFrameLocks xmlns:a="http://schemas.openxmlformats.org/drawingml/2006/main" noChangeAspect="1"/>
+            </wp:cNvGraphicFramePr>
+            <a:graphic xmlns:a="http://schemas.openxmlformats.org/drawingml/2006/main">
+              <a:graphicData uri="http://schemas.openxmlformats.org/drawingml/2006/picture">
+                <pic:pic xmlns:pic="http://schemas.openxmlformats.org/drawingml/2006/picture">
+                  <pic:nvPicPr>
+                    <pic:cNvPr id="165680092" name=""/>
+                    <pic:cNvPicPr/>
+                  </pic:nvPicPr>
+                  <pic:blipFill>
+                    <a:blip r:embed="rId30"/>
+                    <a:stretch>
+                      <a:fillRect/>
+                    </a:stretch>
+                  </pic:blipFill>
+                  <pic:spPr>
+                    <a:xfrm>
+                      <a:off x="0" y="0"/>
+                      <a:ext cx="3302170" cy="1511378"/>
+                    </a:xfrm>
+                    <a:prstGeom prst="rect">
+                      <a:avLst/>
+                    </a:prstGeom>
+                  </pic:spPr>
+                </pic:pic>
+              </a:graphicData>
+            </a:graphic>
+          </wp:inline>
+        </w:drawing>
+      </w:r>
+    </w:p>
+    <w:p>
+      <w:pPr>
+        <w:spacing w:after="0"/>
+        <w:ind w:left="708" w:hanging="708"/>
+        <w:jc w:val="both"/>
+        <w:rPr>
+          <w:rFonts w:ascii="Times New Roman" w:hAnsi="Times New Roman" w:cs="Times New Roman"/>
+        </w:rPr>
+      </w:pPr>
+      <w:r>
+        <w:rPr>
+          <w:rFonts w:ascii="Times New Roman" w:hAnsi="Times New Roman" w:cs="Times New Roman"/>
+        </w:rPr>
+        <w:t xml:space="preserve">Se evitan las referencias duplicadas desde la función </w:t>
+      </w:r>
+      <w:proofErr w:type="spellStart"/>
+      <w:proofErr w:type="gramStart"/>
+      <w:r>
+        <w:rPr>
+          <w:rFonts w:ascii="Times New Roman" w:hAnsi="Times New Roman" w:cs="Times New Roman"/>
+        </w:rPr>
+        <w:t>click</w:t>
+      </w:r>
+      <w:proofErr w:type="spellEnd"/>
+      <w:proofErr w:type="gramEnd"/>
+      <w:r>
+        <w:rPr>
+          <w:rFonts w:ascii="Times New Roman" w:hAnsi="Times New Roman" w:cs="Times New Roman"/>
+        </w:rPr>
+        <w:t>, se mantiene la lógica solo se agrega una protección.</w:t>
       </w:r>
     </w:p>
     <w:sectPr>

</xml_diff>

<commit_message>
recalculo de celdas, al editar datos de una celda
</commit_message>
<xml_diff>
--- a/Bitacora/5.6 Bitácora de desarrollo.docx
+++ b/Bitacora/5.6 Bitácora de desarrollo.docx
@@ -204,21 +204,7 @@
         <w:rPr>
           <w:rFonts w:ascii="Times New Roman" w:hAnsi="Times New Roman" w:cs="Times New Roman"/>
         </w:rPr>
-        <w:t>Proceso de análisis y diseño en 5.2 Diagramas de flujo (PSeInt</w:t>
-      </w:r>
-      <w:proofErr w:type="gramStart"/>
-      <w:r>
-        <w:rPr>
-          <w:rFonts w:ascii="Times New Roman" w:hAnsi="Times New Roman" w:cs="Times New Roman"/>
-        </w:rPr>
-        <w:t>)(</w:t>
-      </w:r>
-      <w:proofErr w:type="gramEnd"/>
-      <w:r>
-        <w:rPr>
-          <w:rFonts w:ascii="Times New Roman" w:hAnsi="Times New Roman" w:cs="Times New Roman"/>
-        </w:rPr>
-        <w:t>inciso 1 y 2)</w:t>
+        <w:t>Proceso de análisis y diseño en 5.2 Diagramas de flujo (PSeInt)(inciso 1 y 2)</w:t>
       </w:r>
     </w:p>
     <w:p>
@@ -368,21 +354,7 @@
         <w:rPr>
           <w:rFonts w:ascii="Times New Roman" w:hAnsi="Times New Roman" w:cs="Times New Roman"/>
         </w:rPr>
-        <w:t xml:space="preserve">Avance: Se trabajó en el punto 3, evaluación de la expresión </w:t>
-      </w:r>
-      <w:proofErr w:type="spellStart"/>
-      <w:r>
-        <w:rPr>
-          <w:rFonts w:ascii="Times New Roman" w:hAnsi="Times New Roman" w:cs="Times New Roman"/>
-        </w:rPr>
-        <w:t>tokenizada</w:t>
-      </w:r>
-      <w:proofErr w:type="spellEnd"/>
-      <w:r>
-        <w:rPr>
-          <w:rFonts w:ascii="Times New Roman" w:hAnsi="Times New Roman" w:cs="Times New Roman"/>
-        </w:rPr>
-        <w:t>.</w:t>
+        <w:t>Avance: Se trabajó en el punto 3, evaluación de la expresión tokenizada.</w:t>
       </w:r>
     </w:p>
     <w:p>
@@ -486,21 +458,7 @@
         <w:rPr>
           <w:rFonts w:ascii="Times New Roman" w:hAnsi="Times New Roman" w:cs="Times New Roman"/>
         </w:rPr>
-        <w:t xml:space="preserve">Decisión y solución: Se implementó </w:t>
-      </w:r>
-      <w:proofErr w:type="spellStart"/>
-      <w:r>
-        <w:rPr>
-          <w:rFonts w:ascii="Times New Roman" w:hAnsi="Times New Roman" w:cs="Times New Roman"/>
-        </w:rPr>
-        <w:t>PropagarCambios</w:t>
-      </w:r>
-      <w:proofErr w:type="spellEnd"/>
-      <w:r>
-        <w:rPr>
-          <w:rFonts w:ascii="Times New Roman" w:hAnsi="Times New Roman" w:cs="Times New Roman"/>
-        </w:rPr>
-        <w:t xml:space="preserve"> para recorrer las dependencias y recalcular las celdas en el orden correspondiente.</w:t>
+        <w:t>Decisión y solución: Se implementó PropagarCambios para recorrer las dependencias y recalcular las celdas en el orden correspondiente.</w:t>
       </w:r>
     </w:p>
     <w:p>
@@ -712,21 +670,7 @@
           <w:rFonts w:ascii="Times New Roman" w:hAnsi="Times New Roman" w:cs="Times New Roman"/>
         </w:rPr>
         <w:br/>
-        <w:t xml:space="preserve">Se implementó </w:t>
-      </w:r>
-      <w:proofErr w:type="spellStart"/>
-      <w:r>
-        <w:rPr>
-          <w:rFonts w:ascii="Times New Roman" w:hAnsi="Times New Roman" w:cs="Times New Roman"/>
-        </w:rPr>
-        <w:t>DetectarReferenciaCircular</w:t>
-      </w:r>
-      <w:proofErr w:type="spellEnd"/>
-      <w:r>
-        <w:rPr>
-          <w:rFonts w:ascii="Times New Roman" w:hAnsi="Times New Roman" w:cs="Times New Roman"/>
-        </w:rPr>
-        <w:t xml:space="preserve"> para recorrer las dependencias y comprobar si </w:t>
+        <w:t xml:space="preserve">Se implementó DetectarReferenciaCircular para recorrer las dependencias y comprobar si </w:t>
       </w:r>
       <w:r>
         <w:rPr>
@@ -918,21 +862,7 @@
         <w:rPr>
           <w:rFonts w:ascii="Times New Roman" w:hAnsi="Times New Roman" w:cs="Times New Roman"/>
         </w:rPr>
-        <w:t xml:space="preserve">Esto ocupaba mucho espacio por lo que se </w:t>
-      </w:r>
-      <w:proofErr w:type="spellStart"/>
-      <w:r>
-        <w:rPr>
-          <w:rFonts w:ascii="Times New Roman" w:hAnsi="Times New Roman" w:cs="Times New Roman"/>
-        </w:rPr>
-        <w:t>investigo</w:t>
-      </w:r>
-      <w:proofErr w:type="spellEnd"/>
-      <w:r>
-        <w:rPr>
-          <w:rFonts w:ascii="Times New Roman" w:hAnsi="Times New Roman" w:cs="Times New Roman"/>
-        </w:rPr>
-        <w:t xml:space="preserve"> como hacerlo ya que coloque tres títulos.</w:t>
+        <w:t>Esto ocupaba mucho espacio por lo que se investigo como hacerlo ya que coloque tres títulos.</w:t>
       </w:r>
     </w:p>
     <w:p>
@@ -1006,21 +936,7 @@
         <w:rPr>
           <w:rFonts w:ascii="Times New Roman" w:hAnsi="Times New Roman" w:cs="Times New Roman"/>
         </w:rPr>
-        <w:t xml:space="preserve">Obteniendo algo más ordenado, pero hasta este punto con referente a la barra de tareas no </w:t>
-      </w:r>
-      <w:proofErr w:type="spellStart"/>
-      <w:r>
-        <w:rPr>
-          <w:rFonts w:ascii="Times New Roman" w:hAnsi="Times New Roman" w:cs="Times New Roman"/>
-        </w:rPr>
-        <w:t>tenia</w:t>
-      </w:r>
-      <w:proofErr w:type="spellEnd"/>
-      <w:r>
-        <w:rPr>
-          <w:rFonts w:ascii="Times New Roman" w:hAnsi="Times New Roman" w:cs="Times New Roman"/>
-        </w:rPr>
-        <w:t xml:space="preserve"> las medidas exactas para cumplir con una mejor interfaz.</w:t>
+        <w:t>Obteniendo algo más ordenado, pero hasta este punto con referente a la barra de tareas no tenia las medidas exactas para cumplir con una mejor interfaz.</w:t>
       </w:r>
     </w:p>
     <w:p>
@@ -1158,7 +1074,7 @@
         </w:rPr>
         <w:lastRenderedPageBreak/>
         <w:drawing>
-          <wp:anchor distT="0" distB="0" distL="114300" distR="114300" simplePos="0" relativeHeight="251661312" behindDoc="0" locked="0" layoutInCell="1" allowOverlap="1" wp14:anchorId="0850277E" wp14:editId="401D797A">
+          <wp:anchor distT="0" distB="0" distL="114300" distR="114300" simplePos="0" relativeHeight="251661312" behindDoc="0" locked="0" layoutInCell="1" allowOverlap="1" wp14:anchorId="0850277E" wp14:editId="4707A432">
             <wp:simplePos x="0" y="0"/>
             <wp:positionH relativeFrom="column">
               <wp:posOffset>2216</wp:posOffset>
@@ -1428,21 +1344,7 @@
         <w:rPr>
           <w:rFonts w:ascii="Times New Roman" w:hAnsi="Times New Roman" w:cs="Times New Roman"/>
         </w:rPr>
-        <w:t>=</w:t>
-      </w:r>
-      <w:proofErr w:type="gramStart"/>
-      <w:r>
-        <w:rPr>
-          <w:rFonts w:ascii="Times New Roman" w:hAnsi="Times New Roman" w:cs="Times New Roman"/>
-        </w:rPr>
-        <w:t>SUMA(</w:t>
-      </w:r>
-      <w:proofErr w:type="gramEnd"/>
-      <w:r>
-        <w:rPr>
-          <w:rFonts w:ascii="Times New Roman" w:hAnsi="Times New Roman" w:cs="Times New Roman"/>
-        </w:rPr>
-        <w:t>A1:A2)</w:t>
+        <w:t>=SUMA(A1:A2)</w:t>
       </w:r>
       <w:r>
         <w:rPr>
@@ -2220,7 +2122,7 @@
           <w:noProof/>
         </w:rPr>
         <w:drawing>
-          <wp:anchor distT="0" distB="0" distL="114300" distR="114300" simplePos="0" relativeHeight="251670528" behindDoc="0" locked="0" layoutInCell="1" allowOverlap="1" wp14:anchorId="3BECA6C0" wp14:editId="04049D91">
+          <wp:anchor distT="0" distB="0" distL="114300" distR="114300" simplePos="0" relativeHeight="251670528" behindDoc="0" locked="0" layoutInCell="1" allowOverlap="1" wp14:anchorId="3BECA6C0" wp14:editId="42DD836C">
             <wp:simplePos x="0" y="0"/>
             <wp:positionH relativeFrom="column">
               <wp:posOffset>2216</wp:posOffset>
@@ -2312,7 +2214,7 @@
         </w:rPr>
         <w:lastRenderedPageBreak/>
         <w:drawing>
-          <wp:anchor distT="0" distB="0" distL="114300" distR="114300" simplePos="0" relativeHeight="251673600" behindDoc="0" locked="0" layoutInCell="1" allowOverlap="1" wp14:anchorId="622E9F32" wp14:editId="149DC7BF">
+          <wp:anchor distT="0" distB="0" distL="114300" distR="114300" simplePos="0" relativeHeight="251673600" behindDoc="0" locked="0" layoutInCell="1" allowOverlap="1" wp14:anchorId="622E9F32" wp14:editId="1EEB45B2">
             <wp:simplePos x="0" y="0"/>
             <wp:positionH relativeFrom="column">
               <wp:posOffset>-268514</wp:posOffset>
@@ -2375,21 +2277,7 @@
         <w:rPr>
           <w:rFonts w:ascii="Times New Roman" w:hAnsi="Times New Roman" w:cs="Times New Roman"/>
         </w:rPr>
-        <w:t xml:space="preserve">Se agrega la función de </w:t>
-      </w:r>
-      <w:proofErr w:type="spellStart"/>
-      <w:r>
-        <w:rPr>
-          <w:rFonts w:ascii="Times New Roman" w:hAnsi="Times New Roman" w:cs="Times New Roman"/>
-        </w:rPr>
-        <w:t>ctrl+z</w:t>
-      </w:r>
-      <w:proofErr w:type="spellEnd"/>
-      <w:r>
-        <w:rPr>
-          <w:rFonts w:ascii="Times New Roman" w:hAnsi="Times New Roman" w:cs="Times New Roman"/>
-        </w:rPr>
-        <w:t xml:space="preserve"> para deshacer, pero ocurre el problema que elimina todos los datos si no hemos dado guardar, el objetivo es deshacer celda por celda.</w:t>
+        <w:t>Se agrega la función de ctrl+z para deshacer, pero ocurre el problema que elimina todos los datos si no hemos dado guardar, el objetivo es deshacer celda por celda.</w:t>
       </w:r>
     </w:p>
     <w:p>
@@ -2403,6 +2291,7 @@
       <w:r>
         <w:rPr>
           <w:rFonts w:ascii="Times New Roman" w:hAnsi="Times New Roman" w:cs="Times New Roman"/>
+          <w:noProof/>
           <w:u w:val="single"/>
         </w:rPr>
         <w:drawing>
@@ -2466,6 +2355,7 @@
       <w:r>
         <w:rPr>
           <w:rFonts w:ascii="Times New Roman" w:hAnsi="Times New Roman" w:cs="Times New Roman"/>
+          <w:noProof/>
         </w:rPr>
         <w:drawing>
           <wp:inline distT="0" distB="0" distL="0" distR="0" wp14:anchorId="5F6808B2" wp14:editId="352283B5">
@@ -2517,24 +2407,230 @@
         <w:rPr>
           <w:rFonts w:ascii="Times New Roman" w:hAnsi="Times New Roman" w:cs="Times New Roman"/>
         </w:rPr>
-        <w:t xml:space="preserve">Se evitan las referencias duplicadas desde la función </w:t>
-      </w:r>
-      <w:proofErr w:type="spellStart"/>
-      <w:proofErr w:type="gramStart"/>
-      <w:r>
-        <w:rPr>
-          <w:rFonts w:ascii="Times New Roman" w:hAnsi="Times New Roman" w:cs="Times New Roman"/>
-        </w:rPr>
-        <w:t>click</w:t>
-      </w:r>
-      <w:proofErr w:type="spellEnd"/>
-      <w:proofErr w:type="gramEnd"/>
-      <w:r>
-        <w:rPr>
-          <w:rFonts w:ascii="Times New Roman" w:hAnsi="Times New Roman" w:cs="Times New Roman"/>
-        </w:rPr>
-        <w:t>, se mantiene la lógica solo se agrega una protección.</w:t>
-      </w:r>
+        <w:t>Se evitan las referencias duplicadas desde la función click, se mantiene la lógica solo se agrega una protección.</w:t>
+      </w:r>
+    </w:p>
+    <w:p>
+      <w:pPr>
+        <w:spacing w:after="0"/>
+        <w:ind w:left="708" w:hanging="708"/>
+        <w:jc w:val="both"/>
+        <w:rPr>
+          <w:rFonts w:ascii="Times New Roman" w:hAnsi="Times New Roman" w:cs="Times New Roman"/>
+        </w:rPr>
+      </w:pPr>
+    </w:p>
+    <w:p>
+      <w:pPr>
+        <w:spacing w:after="0"/>
+        <w:ind w:left="708" w:hanging="708"/>
+        <w:jc w:val="both"/>
+        <w:rPr>
+          <w:rFonts w:ascii="Times New Roman" w:hAnsi="Times New Roman" w:cs="Times New Roman"/>
+          <w:u w:val="single"/>
+        </w:rPr>
+      </w:pPr>
+      <w:r>
+        <w:rPr>
+          <w:rFonts w:ascii="Times New Roman" w:hAnsi="Times New Roman" w:cs="Times New Roman"/>
+        </w:rPr>
+        <w:lastRenderedPageBreak/>
+        <w:drawing>
+          <wp:anchor distT="0" distB="0" distL="114300" distR="114300" simplePos="0" relativeHeight="251674624" behindDoc="0" locked="0" layoutInCell="1" allowOverlap="1" wp14:anchorId="2AB5E3BF" wp14:editId="051448E4">
+            <wp:simplePos x="0" y="0"/>
+            <wp:positionH relativeFrom="margin">
+              <wp:align>left</wp:align>
+            </wp:positionH>
+            <wp:positionV relativeFrom="paragraph">
+              <wp:posOffset>634197</wp:posOffset>
+            </wp:positionV>
+            <wp:extent cx="3314870" cy="2838596"/>
+            <wp:effectExtent l="0" t="0" r="0" b="0"/>
+            <wp:wrapTopAndBottom/>
+            <wp:docPr id="505606273" name="Imagen 1"/>
+            <wp:cNvGraphicFramePr>
+              <a:graphicFrameLocks xmlns:a="http://schemas.openxmlformats.org/drawingml/2006/main" noChangeAspect="1"/>
+            </wp:cNvGraphicFramePr>
+            <a:graphic xmlns:a="http://schemas.openxmlformats.org/drawingml/2006/main">
+              <a:graphicData uri="http://schemas.openxmlformats.org/drawingml/2006/picture">
+                <pic:pic xmlns:pic="http://schemas.openxmlformats.org/drawingml/2006/picture">
+                  <pic:nvPicPr>
+                    <pic:cNvPr id="505606273" name=""/>
+                    <pic:cNvPicPr/>
+                  </pic:nvPicPr>
+                  <pic:blipFill>
+                    <a:blip r:embed="rId31">
+                      <a:extLst>
+                        <a:ext uri="{28A0092B-C50C-407E-A947-70E740481C1C}">
+                          <a14:useLocalDpi xmlns:a14="http://schemas.microsoft.com/office/drawing/2010/main" val="0"/>
+                        </a:ext>
+                      </a:extLst>
+                    </a:blip>
+                    <a:stretch>
+                      <a:fillRect/>
+                    </a:stretch>
+                  </pic:blipFill>
+                  <pic:spPr>
+                    <a:xfrm>
+                      <a:off x="0" y="0"/>
+                      <a:ext cx="3314870" cy="2838596"/>
+                    </a:xfrm>
+                    <a:prstGeom prst="rect">
+                      <a:avLst/>
+                    </a:prstGeom>
+                  </pic:spPr>
+                </pic:pic>
+              </a:graphicData>
+            </a:graphic>
+          </wp:anchor>
+        </w:drawing>
+      </w:r>
+      <w:r>
+        <w:rPr>
+          <w:rFonts w:ascii="Times New Roman" w:hAnsi="Times New Roman" w:cs="Times New Roman"/>
+        </w:rPr>
+        <w:t>si ingresaba valores a la tabla, luego regresaba para editar el mismo se concatenaba no se reemplazaba. Se agrego dentro de la función seleccionar una condición para que realice el reemplazo del mismo.</w:t>
+      </w:r>
+    </w:p>
+    <w:p>
+      <w:pPr>
+        <w:spacing w:after="0"/>
+        <w:ind w:left="708" w:hanging="708"/>
+        <w:jc w:val="both"/>
+        <w:rPr>
+          <w:rFonts w:ascii="Times New Roman" w:hAnsi="Times New Roman" w:cs="Times New Roman"/>
+          <w:u w:val="single"/>
+        </w:rPr>
+      </w:pPr>
+    </w:p>
+    <w:p>
+      <w:pPr>
+        <w:spacing w:after="0"/>
+        <w:ind w:left="708" w:hanging="708"/>
+        <w:jc w:val="both"/>
+        <w:rPr>
+          <w:rFonts w:ascii="Times New Roman" w:hAnsi="Times New Roman" w:cs="Times New Roman"/>
+          <w:u w:val="single"/>
+        </w:rPr>
+      </w:pPr>
+      <w:r>
+        <w:rPr>
+          <w:rFonts w:ascii="Times New Roman" w:hAnsi="Times New Roman" w:cs="Times New Roman"/>
+        </w:rPr>
+        <w:drawing>
+          <wp:anchor distT="0" distB="0" distL="114300" distR="114300" simplePos="0" relativeHeight="251675648" behindDoc="0" locked="0" layoutInCell="1" allowOverlap="1" wp14:anchorId="6EA7AF7B" wp14:editId="04D56CAE">
+            <wp:simplePos x="0" y="0"/>
+            <wp:positionH relativeFrom="margin">
+              <wp:align>left</wp:align>
+            </wp:positionH>
+            <wp:positionV relativeFrom="paragraph">
+              <wp:posOffset>226177</wp:posOffset>
+            </wp:positionV>
+            <wp:extent cx="2324219" cy="2648086"/>
+            <wp:effectExtent l="0" t="0" r="0" b="0"/>
+            <wp:wrapTopAndBottom/>
+            <wp:docPr id="1175038868" name="Imagen 1"/>
+            <wp:cNvGraphicFramePr>
+              <a:graphicFrameLocks xmlns:a="http://schemas.openxmlformats.org/drawingml/2006/main" noChangeAspect="1"/>
+            </wp:cNvGraphicFramePr>
+            <a:graphic xmlns:a="http://schemas.openxmlformats.org/drawingml/2006/main">
+              <a:graphicData uri="http://schemas.openxmlformats.org/drawingml/2006/picture">
+                <pic:pic xmlns:pic="http://schemas.openxmlformats.org/drawingml/2006/picture">
+                  <pic:nvPicPr>
+                    <pic:cNvPr id="1175038868" name=""/>
+                    <pic:cNvPicPr/>
+                  </pic:nvPicPr>
+                  <pic:blipFill>
+                    <a:blip r:embed="rId32">
+                      <a:extLst>
+                        <a:ext uri="{28A0092B-C50C-407E-A947-70E740481C1C}">
+                          <a14:useLocalDpi xmlns:a14="http://schemas.microsoft.com/office/drawing/2010/main" val="0"/>
+                        </a:ext>
+                      </a:extLst>
+                    </a:blip>
+                    <a:stretch>
+                      <a:fillRect/>
+                    </a:stretch>
+                  </pic:blipFill>
+                  <pic:spPr>
+                    <a:xfrm>
+                      <a:off x="0" y="0"/>
+                      <a:ext cx="2324219" cy="2648086"/>
+                    </a:xfrm>
+                    <a:prstGeom prst="rect">
+                      <a:avLst/>
+                    </a:prstGeom>
+                  </pic:spPr>
+                </pic:pic>
+              </a:graphicData>
+            </a:graphic>
+          </wp:anchor>
+        </w:drawing>
+      </w:r>
+      <w:r>
+        <w:rPr>
+          <w:rFonts w:ascii="Times New Roman" w:hAnsi="Times New Roman" w:cs="Times New Roman"/>
+        </w:rPr>
+        <w:t>Si real</w:t>
+      </w:r>
+      <w:r>
+        <w:rPr>
+          <w:rFonts w:ascii="Times New Roman" w:hAnsi="Times New Roman" w:cs="Times New Roman"/>
+        </w:rPr>
+        <w:t>izamos alguna operación matemática con celda vacía no mostraba nada.</w:t>
+      </w:r>
+    </w:p>
+    <w:p>
+      <w:pPr>
+        <w:spacing w:after="0"/>
+        <w:ind w:left="708" w:hanging="708"/>
+        <w:jc w:val="both"/>
+        <w:rPr>
+          <w:rFonts w:ascii="Times New Roman" w:hAnsi="Times New Roman" w:cs="Times New Roman"/>
+        </w:rPr>
+      </w:pPr>
+    </w:p>
+    <w:p>
+      <w:pPr>
+        <w:spacing w:after="0"/>
+        <w:ind w:left="708" w:hanging="708"/>
+        <w:jc w:val="both"/>
+        <w:rPr>
+          <w:rFonts w:ascii="Times New Roman" w:hAnsi="Times New Roman" w:cs="Times New Roman"/>
+        </w:rPr>
+      </w:pPr>
+      <w:r>
+        <w:rPr>
+          <w:rFonts w:ascii="Times New Roman" w:hAnsi="Times New Roman" w:cs="Times New Roman"/>
+        </w:rPr>
+        <w:t>Si realizaba una operación matemática, no recalculaba de forma inmediata si modificaba un dato de la celda</w:t>
+      </w:r>
+      <w:r>
+        <w:rPr>
+          <w:rFonts w:ascii="Times New Roman" w:hAnsi="Times New Roman" w:cs="Times New Roman"/>
+        </w:rPr>
+        <w:t>. Con la nueva función de recalculo quedo bien.</w:t>
+      </w:r>
+    </w:p>
+    <w:p>
+      <w:pPr>
+        <w:spacing w:after="0"/>
+        <w:ind w:left="708" w:hanging="708"/>
+        <w:jc w:val="both"/>
+        <w:rPr>
+          <w:rFonts w:ascii="Times New Roman" w:hAnsi="Times New Roman" w:cs="Times New Roman"/>
+        </w:rPr>
+      </w:pPr>
+    </w:p>
+    <w:p>
+      <w:pPr>
+        <w:spacing w:after="0"/>
+        <w:ind w:left="708" w:hanging="708"/>
+        <w:jc w:val="both"/>
+        <w:rPr>
+          <w:rFonts w:ascii="Times New Roman" w:hAnsi="Times New Roman" w:cs="Times New Roman"/>
+        </w:rPr>
+      </w:pPr>
     </w:p>
     <w:sectPr>
       <w:pgSz w:w="12240" w:h="15840"/>

</xml_diff>

<commit_message>
reestructura botones para visualización usuario
</commit_message>
<xml_diff>
--- a/Bitacora/5.6 Bitácora de desarrollo.docx
+++ b/Bitacora/5.6 Bitácora de desarrollo.docx
@@ -204,7 +204,21 @@
         <w:rPr>
           <w:rFonts w:ascii="Times New Roman" w:hAnsi="Times New Roman" w:cs="Times New Roman"/>
         </w:rPr>
-        <w:t>Proceso de análisis y diseño en 5.2 Diagramas de flujo (PSeInt)(inciso 1 y 2)</w:t>
+        <w:t>Proceso de análisis y diseño en 5.2 Diagramas de flujo (PSeInt</w:t>
+      </w:r>
+      <w:proofErr w:type="gramStart"/>
+      <w:r>
+        <w:rPr>
+          <w:rFonts w:ascii="Times New Roman" w:hAnsi="Times New Roman" w:cs="Times New Roman"/>
+        </w:rPr>
+        <w:t>)(</w:t>
+      </w:r>
+      <w:proofErr w:type="gramEnd"/>
+      <w:r>
+        <w:rPr>
+          <w:rFonts w:ascii="Times New Roman" w:hAnsi="Times New Roman" w:cs="Times New Roman"/>
+        </w:rPr>
+        <w:t>inciso 1 y 2)</w:t>
       </w:r>
     </w:p>
     <w:p>
@@ -354,7 +368,21 @@
         <w:rPr>
           <w:rFonts w:ascii="Times New Roman" w:hAnsi="Times New Roman" w:cs="Times New Roman"/>
         </w:rPr>
-        <w:t>Avance: Se trabajó en el punto 3, evaluación de la expresión tokenizada.</w:t>
+        <w:t xml:space="preserve">Avance: Se trabajó en el punto 3, evaluación de la expresión </w:t>
+      </w:r>
+      <w:proofErr w:type="spellStart"/>
+      <w:r>
+        <w:rPr>
+          <w:rFonts w:ascii="Times New Roman" w:hAnsi="Times New Roman" w:cs="Times New Roman"/>
+        </w:rPr>
+        <w:t>tokenizada</w:t>
+      </w:r>
+      <w:proofErr w:type="spellEnd"/>
+      <w:r>
+        <w:rPr>
+          <w:rFonts w:ascii="Times New Roman" w:hAnsi="Times New Roman" w:cs="Times New Roman"/>
+        </w:rPr>
+        <w:t>.</w:t>
       </w:r>
     </w:p>
     <w:p>
@@ -458,7 +486,21 @@
         <w:rPr>
           <w:rFonts w:ascii="Times New Roman" w:hAnsi="Times New Roman" w:cs="Times New Roman"/>
         </w:rPr>
-        <w:t>Decisión y solución: Se implementó PropagarCambios para recorrer las dependencias y recalcular las celdas en el orden correspondiente.</w:t>
+        <w:t xml:space="preserve">Decisión y solución: Se implementó </w:t>
+      </w:r>
+      <w:proofErr w:type="spellStart"/>
+      <w:r>
+        <w:rPr>
+          <w:rFonts w:ascii="Times New Roman" w:hAnsi="Times New Roman" w:cs="Times New Roman"/>
+        </w:rPr>
+        <w:t>PropagarCambios</w:t>
+      </w:r>
+      <w:proofErr w:type="spellEnd"/>
+      <w:r>
+        <w:rPr>
+          <w:rFonts w:ascii="Times New Roman" w:hAnsi="Times New Roman" w:cs="Times New Roman"/>
+        </w:rPr>
+        <w:t xml:space="preserve"> para recorrer las dependencias y recalcular las celdas en el orden correspondiente.</w:t>
       </w:r>
     </w:p>
     <w:p>
@@ -670,7 +712,21 @@
           <w:rFonts w:ascii="Times New Roman" w:hAnsi="Times New Roman" w:cs="Times New Roman"/>
         </w:rPr>
         <w:br/>
-        <w:t xml:space="preserve">Se implementó DetectarReferenciaCircular para recorrer las dependencias y comprobar si </w:t>
+        <w:t xml:space="preserve">Se implementó </w:t>
+      </w:r>
+      <w:proofErr w:type="spellStart"/>
+      <w:r>
+        <w:rPr>
+          <w:rFonts w:ascii="Times New Roman" w:hAnsi="Times New Roman" w:cs="Times New Roman"/>
+        </w:rPr>
+        <w:t>DetectarReferenciaCircular</w:t>
+      </w:r>
+      <w:proofErr w:type="spellEnd"/>
+      <w:r>
+        <w:rPr>
+          <w:rFonts w:ascii="Times New Roman" w:hAnsi="Times New Roman" w:cs="Times New Roman"/>
+        </w:rPr>
+        <w:t xml:space="preserve"> para recorrer las dependencias y comprobar si </w:t>
       </w:r>
       <w:r>
         <w:rPr>
@@ -862,7 +918,21 @@
         <w:rPr>
           <w:rFonts w:ascii="Times New Roman" w:hAnsi="Times New Roman" w:cs="Times New Roman"/>
         </w:rPr>
-        <w:t>Esto ocupaba mucho espacio por lo que se investigo como hacerlo ya que coloque tres títulos.</w:t>
+        <w:t xml:space="preserve">Esto ocupaba mucho espacio por lo que se </w:t>
+      </w:r>
+      <w:proofErr w:type="spellStart"/>
+      <w:r>
+        <w:rPr>
+          <w:rFonts w:ascii="Times New Roman" w:hAnsi="Times New Roman" w:cs="Times New Roman"/>
+        </w:rPr>
+        <w:t>investigo</w:t>
+      </w:r>
+      <w:proofErr w:type="spellEnd"/>
+      <w:r>
+        <w:rPr>
+          <w:rFonts w:ascii="Times New Roman" w:hAnsi="Times New Roman" w:cs="Times New Roman"/>
+        </w:rPr>
+        <w:t xml:space="preserve"> como hacerlo ya que coloque tres títulos.</w:t>
       </w:r>
     </w:p>
     <w:p>
@@ -936,7 +1006,21 @@
         <w:rPr>
           <w:rFonts w:ascii="Times New Roman" w:hAnsi="Times New Roman" w:cs="Times New Roman"/>
         </w:rPr>
-        <w:t>Obteniendo algo más ordenado, pero hasta este punto con referente a la barra de tareas no tenia las medidas exactas para cumplir con una mejor interfaz.</w:t>
+        <w:t xml:space="preserve">Obteniendo algo más ordenado, pero hasta este punto con referente a la barra de tareas no </w:t>
+      </w:r>
+      <w:proofErr w:type="spellStart"/>
+      <w:r>
+        <w:rPr>
+          <w:rFonts w:ascii="Times New Roman" w:hAnsi="Times New Roman" w:cs="Times New Roman"/>
+        </w:rPr>
+        <w:t>tenia</w:t>
+      </w:r>
+      <w:proofErr w:type="spellEnd"/>
+      <w:r>
+        <w:rPr>
+          <w:rFonts w:ascii="Times New Roman" w:hAnsi="Times New Roman" w:cs="Times New Roman"/>
+        </w:rPr>
+        <w:t xml:space="preserve"> las medidas exactas para cumplir con una mejor interfaz.</w:t>
       </w:r>
     </w:p>
     <w:p>
@@ -1344,7 +1428,21 @@
         <w:rPr>
           <w:rFonts w:ascii="Times New Roman" w:hAnsi="Times New Roman" w:cs="Times New Roman"/>
         </w:rPr>
-        <w:t>=SUMA(A1:A2)</w:t>
+        <w:t>=</w:t>
+      </w:r>
+      <w:proofErr w:type="gramStart"/>
+      <w:r>
+        <w:rPr>
+          <w:rFonts w:ascii="Times New Roman" w:hAnsi="Times New Roman" w:cs="Times New Roman"/>
+        </w:rPr>
+        <w:t>SUMA(</w:t>
+      </w:r>
+      <w:proofErr w:type="gramEnd"/>
+      <w:r>
+        <w:rPr>
+          <w:rFonts w:ascii="Times New Roman" w:hAnsi="Times New Roman" w:cs="Times New Roman"/>
+        </w:rPr>
+        <w:t>A1:A2)</w:t>
       </w:r>
       <w:r>
         <w:rPr>
@@ -2277,7 +2375,21 @@
         <w:rPr>
           <w:rFonts w:ascii="Times New Roman" w:hAnsi="Times New Roman" w:cs="Times New Roman"/>
         </w:rPr>
-        <w:t>Se agrega la función de ctrl+z para deshacer, pero ocurre el problema que elimina todos los datos si no hemos dado guardar, el objetivo es deshacer celda por celda.</w:t>
+        <w:t xml:space="preserve">Se agrega la función de </w:t>
+      </w:r>
+      <w:proofErr w:type="spellStart"/>
+      <w:r>
+        <w:rPr>
+          <w:rFonts w:ascii="Times New Roman" w:hAnsi="Times New Roman" w:cs="Times New Roman"/>
+        </w:rPr>
+        <w:t>ctrl+z</w:t>
+      </w:r>
+      <w:proofErr w:type="spellEnd"/>
+      <w:r>
+        <w:rPr>
+          <w:rFonts w:ascii="Times New Roman" w:hAnsi="Times New Roman" w:cs="Times New Roman"/>
+        </w:rPr>
+        <w:t xml:space="preserve"> para deshacer, pero ocurre el problema que elimina todos los datos si no hemos dado guardar, el objetivo es deshacer celda por celda.</w:t>
       </w:r>
     </w:p>
     <w:p>
@@ -2407,7 +2519,23 @@
         <w:rPr>
           <w:rFonts w:ascii="Times New Roman" w:hAnsi="Times New Roman" w:cs="Times New Roman"/>
         </w:rPr>
-        <w:t>Se evitan las referencias duplicadas desde la función click, se mantiene la lógica solo se agrega una protección.</w:t>
+        <w:t xml:space="preserve">Se evitan las referencias duplicadas desde la función </w:t>
+      </w:r>
+      <w:proofErr w:type="spellStart"/>
+      <w:proofErr w:type="gramStart"/>
+      <w:r>
+        <w:rPr>
+          <w:rFonts w:ascii="Times New Roman" w:hAnsi="Times New Roman" w:cs="Times New Roman"/>
+        </w:rPr>
+        <w:t>click</w:t>
+      </w:r>
+      <w:proofErr w:type="spellEnd"/>
+      <w:proofErr w:type="gramEnd"/>
+      <w:r>
+        <w:rPr>
+          <w:rFonts w:ascii="Times New Roman" w:hAnsi="Times New Roman" w:cs="Times New Roman"/>
+        </w:rPr>
+        <w:t>, se mantiene la lógica solo se agrega una protección.</w:t>
       </w:r>
     </w:p>
     <w:p>
@@ -2436,7 +2564,7 @@
         </w:rPr>
         <w:lastRenderedPageBreak/>
         <w:drawing>
-          <wp:anchor distT="0" distB="0" distL="114300" distR="114300" simplePos="0" relativeHeight="251674624" behindDoc="0" locked="0" layoutInCell="1" allowOverlap="1" wp14:anchorId="2AB5E3BF" wp14:editId="051448E4">
+          <wp:anchor distT="0" distB="0" distL="114300" distR="114300" simplePos="0" relativeHeight="251674624" behindDoc="0" locked="0" layoutInCell="1" allowOverlap="1" wp14:anchorId="2AB5E3BF" wp14:editId="2282CC96">
             <wp:simplePos x="0" y="0"/>
             <wp:positionH relativeFrom="margin">
               <wp:align>left</wp:align>
@@ -2485,11 +2613,33 @@
           </wp:anchor>
         </w:drawing>
       </w:r>
-      <w:r>
-        <w:rPr>
-          <w:rFonts w:ascii="Times New Roman" w:hAnsi="Times New Roman" w:cs="Times New Roman"/>
-        </w:rPr>
-        <w:t>si ingresaba valores a la tabla, luego regresaba para editar el mismo se concatenaba no se reemplazaba. Se agrego dentro de la función seleccionar una condición para que realice el reemplazo del mismo.</w:t>
+      <w:proofErr w:type="spellStart"/>
+      <w:r>
+        <w:rPr>
+          <w:rFonts w:ascii="Times New Roman" w:hAnsi="Times New Roman" w:cs="Times New Roman"/>
+        </w:rPr>
+        <w:t>si</w:t>
+      </w:r>
+      <w:proofErr w:type="spellEnd"/>
+      <w:r>
+        <w:rPr>
+          <w:rFonts w:ascii="Times New Roman" w:hAnsi="Times New Roman" w:cs="Times New Roman"/>
+        </w:rPr>
+        <w:t xml:space="preserve"> ingresaba valores a la tabla, luego regresaba para editar el mismo se concatenaba no se reemplazaba. Se agrego dentro de la función seleccionar una condición para que realice el reemplazo </w:t>
+      </w:r>
+      <w:proofErr w:type="gramStart"/>
+      <w:r>
+        <w:rPr>
+          <w:rFonts w:ascii="Times New Roman" w:hAnsi="Times New Roman" w:cs="Times New Roman"/>
+        </w:rPr>
+        <w:t>del mismo</w:t>
+      </w:r>
+      <w:proofErr w:type="gramEnd"/>
+      <w:r>
+        <w:rPr>
+          <w:rFonts w:ascii="Times New Roman" w:hAnsi="Times New Roman" w:cs="Times New Roman"/>
+        </w:rPr>
+        <w:t>.</w:t>
       </w:r>
     </w:p>
     <w:p>
@@ -2518,7 +2668,7 @@
           <w:rFonts w:ascii="Times New Roman" w:hAnsi="Times New Roman" w:cs="Times New Roman"/>
         </w:rPr>
         <w:drawing>
-          <wp:anchor distT="0" distB="0" distL="114300" distR="114300" simplePos="0" relativeHeight="251675648" behindDoc="0" locked="0" layoutInCell="1" allowOverlap="1" wp14:anchorId="6EA7AF7B" wp14:editId="04D56CAE">
+          <wp:anchor distT="0" distB="0" distL="114300" distR="114300" simplePos="0" relativeHeight="251675648" behindDoc="0" locked="0" layoutInCell="1" allowOverlap="1" wp14:anchorId="6EA7AF7B" wp14:editId="7A6E1C9F">
             <wp:simplePos x="0" y="0"/>
             <wp:positionH relativeFrom="margin">
               <wp:align>left</wp:align>
@@ -2631,6 +2781,174 @@
           <w:rFonts w:ascii="Times New Roman" w:hAnsi="Times New Roman" w:cs="Times New Roman"/>
         </w:rPr>
       </w:pPr>
+    </w:p>
+    <w:p>
+      <w:pPr>
+        <w:spacing w:after="0"/>
+        <w:jc w:val="both"/>
+        <w:rPr>
+          <w:rFonts w:ascii="Times New Roman" w:hAnsi="Times New Roman" w:cs="Times New Roman"/>
+        </w:rPr>
+      </w:pPr>
+      <w:r>
+        <w:rPr>
+          <w:rFonts w:ascii="Times New Roman" w:hAnsi="Times New Roman" w:cs="Times New Roman"/>
+          <w:noProof/>
+        </w:rPr>
+        <w:lastRenderedPageBreak/>
+        <w:drawing>
+          <wp:anchor distT="0" distB="0" distL="114300" distR="114300" simplePos="0" relativeHeight="251676672" behindDoc="0" locked="0" layoutInCell="1" allowOverlap="1" wp14:anchorId="7CFC2302" wp14:editId="5D957DA8">
+            <wp:simplePos x="0" y="0"/>
+            <wp:positionH relativeFrom="margin">
+              <wp:align>left</wp:align>
+            </wp:positionH>
+            <wp:positionV relativeFrom="paragraph">
+              <wp:posOffset>344170</wp:posOffset>
+            </wp:positionV>
+            <wp:extent cx="3434715" cy="1799590"/>
+            <wp:effectExtent l="0" t="0" r="0" b="0"/>
+            <wp:wrapTopAndBottom/>
+            <wp:docPr id="2021317853" name="Imagen 2"/>
+            <wp:cNvGraphicFramePr>
+              <a:graphicFrameLocks xmlns:a="http://schemas.openxmlformats.org/drawingml/2006/main" noChangeAspect="1"/>
+            </wp:cNvGraphicFramePr>
+            <a:graphic xmlns:a="http://schemas.openxmlformats.org/drawingml/2006/main">
+              <a:graphicData uri="http://schemas.openxmlformats.org/drawingml/2006/picture">
+                <pic:pic xmlns:pic="http://schemas.openxmlformats.org/drawingml/2006/picture">
+                  <pic:nvPicPr>
+                    <pic:cNvPr id="0" name="Picture 2"/>
+                    <pic:cNvPicPr>
+                      <a:picLocks noChangeAspect="1" noChangeArrowheads="1"/>
+                    </pic:cNvPicPr>
+                  </pic:nvPicPr>
+                  <pic:blipFill>
+                    <a:blip r:embed="rId33" cstate="print">
+                      <a:extLst>
+                        <a:ext uri="{28A0092B-C50C-407E-A947-70E740481C1C}">
+                          <a14:useLocalDpi xmlns:a14="http://schemas.microsoft.com/office/drawing/2010/main" val="0"/>
+                        </a:ext>
+                      </a:extLst>
+                    </a:blip>
+                    <a:srcRect/>
+                    <a:stretch>
+                      <a:fillRect/>
+                    </a:stretch>
+                  </pic:blipFill>
+                  <pic:spPr bwMode="auto">
+                    <a:xfrm>
+                      <a:off x="0" y="0"/>
+                      <a:ext cx="3434715" cy="1799590"/>
+                    </a:xfrm>
+                    <a:prstGeom prst="rect">
+                      <a:avLst/>
+                    </a:prstGeom>
+                    <a:noFill/>
+                  </pic:spPr>
+                </pic:pic>
+              </a:graphicData>
+            </a:graphic>
+            <wp14:sizeRelH relativeFrom="margin">
+              <wp14:pctWidth>0</wp14:pctWidth>
+            </wp14:sizeRelH>
+            <wp14:sizeRelV relativeFrom="margin">
+              <wp14:pctHeight>0</wp14:pctHeight>
+            </wp14:sizeRelV>
+          </wp:anchor>
+        </w:drawing>
+      </w:r>
+      <w:r>
+        <w:rPr>
+          <w:rFonts w:ascii="Times New Roman" w:hAnsi="Times New Roman" w:cs="Times New Roman"/>
+        </w:rPr>
+        <w:t>los botones quedan sobre las celdas. Se ajusta los márgenes y el espacio de la tabla</w:t>
+      </w:r>
+    </w:p>
+    <w:p>
+      <w:pPr>
+        <w:spacing w:after="0"/>
+        <w:jc w:val="both"/>
+        <w:rPr>
+          <w:rFonts w:ascii="Times New Roman" w:hAnsi="Times New Roman" w:cs="Times New Roman"/>
+        </w:rPr>
+      </w:pPr>
+    </w:p>
+    <w:p>
+      <w:pPr>
+        <w:spacing w:after="0"/>
+        <w:jc w:val="both"/>
+        <w:rPr>
+          <w:rFonts w:ascii="Times New Roman" w:hAnsi="Times New Roman" w:cs="Times New Roman"/>
+        </w:rPr>
+      </w:pPr>
+      <w:r>
+        <w:rPr>
+          <w:rFonts w:ascii="Times New Roman" w:hAnsi="Times New Roman" w:cs="Times New Roman"/>
+        </w:rPr>
+        <w:t>Se logra la reestructuración para tener una mejor visualización por parte del usuario.</w:t>
+      </w:r>
+    </w:p>
+    <w:p>
+      <w:pPr>
+        <w:spacing w:after="0"/>
+        <w:jc w:val="both"/>
+        <w:rPr>
+          <w:rFonts w:ascii="Times New Roman" w:hAnsi="Times New Roman" w:cs="Times New Roman"/>
+        </w:rPr>
+      </w:pPr>
+      <w:r>
+        <w:rPr>
+          <w:rFonts w:ascii="Times New Roman" w:hAnsi="Times New Roman" w:cs="Times New Roman"/>
+        </w:rPr>
+        <w:drawing>
+          <wp:anchor distT="0" distB="0" distL="114300" distR="114300" simplePos="0" relativeHeight="251677696" behindDoc="0" locked="0" layoutInCell="1" allowOverlap="1" wp14:anchorId="323EE5FF" wp14:editId="33F30C4A">
+            <wp:simplePos x="0" y="0"/>
+            <wp:positionH relativeFrom="column">
+              <wp:posOffset>2216</wp:posOffset>
+            </wp:positionH>
+            <wp:positionV relativeFrom="paragraph">
+              <wp:posOffset>3007</wp:posOffset>
+            </wp:positionV>
+            <wp:extent cx="5612130" cy="2855595"/>
+            <wp:effectExtent l="0" t="0" r="7620" b="1905"/>
+            <wp:wrapTopAndBottom/>
+            <wp:docPr id="1754539304" name="Imagen 1"/>
+            <wp:cNvGraphicFramePr>
+              <a:graphicFrameLocks xmlns:a="http://schemas.openxmlformats.org/drawingml/2006/main" noChangeAspect="1"/>
+            </wp:cNvGraphicFramePr>
+            <a:graphic xmlns:a="http://schemas.openxmlformats.org/drawingml/2006/main">
+              <a:graphicData uri="http://schemas.openxmlformats.org/drawingml/2006/picture">
+                <pic:pic xmlns:pic="http://schemas.openxmlformats.org/drawingml/2006/picture">
+                  <pic:nvPicPr>
+                    <pic:cNvPr id="1754539304" name=""/>
+                    <pic:cNvPicPr/>
+                  </pic:nvPicPr>
+                  <pic:blipFill>
+                    <a:blip r:embed="rId34" cstate="print">
+                      <a:extLst>
+                        <a:ext uri="{28A0092B-C50C-407E-A947-70E740481C1C}">
+                          <a14:useLocalDpi xmlns:a14="http://schemas.microsoft.com/office/drawing/2010/main" val="0"/>
+                        </a:ext>
+                      </a:extLst>
+                    </a:blip>
+                    <a:stretch>
+                      <a:fillRect/>
+                    </a:stretch>
+                  </pic:blipFill>
+                  <pic:spPr>
+                    <a:xfrm>
+                      <a:off x="0" y="0"/>
+                      <a:ext cx="5612130" cy="2855595"/>
+                    </a:xfrm>
+                    <a:prstGeom prst="rect">
+                      <a:avLst/>
+                    </a:prstGeom>
+                  </pic:spPr>
+                </pic:pic>
+              </a:graphicData>
+            </a:graphic>
+          </wp:anchor>
+        </w:drawing>
+      </w:r>
     </w:p>
     <w:sectPr>
       <w:pgSz w:w="12240" w:h="15840"/>

</xml_diff>